<commit_message>
Atualiza calendário editorial Strategia agosto 2026 com ajustes de copy
Co-Authored-By: Claude Sonnet 4.6 <noreply@anthropic.com>
</commit_message>
<xml_diff>
--- a/strategia-sindicos/calendarios-editoriais/Calendario_Editorial_Strategia_Agosto2026.docx
+++ b/strategia-sindicos/calendarios-editoriais/Calendario_Editorial_Strategia_Agosto2026.docx
@@ -20,13 +20,9 @@
       </w:r>
     </w:p>
     <w:p>
-      <w:pPr>
-        <w:spacing w:before="120"/>
-      </w:pPr>
       <w:r>
         <w:rPr>
           <w:b/>
-          <w:color w:val="FFFFFF"/>
         </w:rPr>
         <w:t>● AGOSTO — Datas: 05/08 (Qua) · 07/08 (Sex) · 12/08 (Qua) · 14/08 (Sex) · 19/08 (Qua) · 21/08 (Sex) · 26/08 (Qua) · 28/08 (Sex)</w:t>
       </w:r>
@@ -174,7 +170,7 @@
     </w:p>
     <w:p>
       <w:r>
-        <w:t>Documentação arquivada — não só assinada e esquecida.</w:t>
+        <w:t>Documentação arquivada, não só assinada e esquecida.</w:t>
       </w:r>
     </w:p>
     <w:p>
@@ -202,7 +198,7 @@
     </w:p>
     <w:p>
       <w:r>
-        <w:t>Orienta o síndico sobre o que assinar — e o que recusar.</w:t>
+        <w:t>Nossos síndicos tem clareza sobre o que assinar e o que recusar.</w:t>
       </w:r>
     </w:p>
     <w:p>
@@ -261,7 +257,7 @@
     </w:p>
     <w:p>
       <w:r>
-        <w:t>Comente: TERCEIRIZADOS e olhe o seu direct — nossa equipe vai te orientar.</w:t>
+        <w:t>Comente: CONDOMÍNIO e olhe o seu direct, nossa equipe vai te orientar.</w:t>
       </w:r>
     </w:p>
     <w:p>
@@ -325,7 +321,7 @@
     </w:p>
     <w:p>
       <w:r>
-        <w:t>Headline: O grupo do condomínio já tirou o sono de alguém aí. E a gestão atual não sabe lidar com isso.</w:t>
+        <w:t>Headline: As conversas no grupo do seu condomínio já tiraram o sono de alguém por aí? A gestão atual sabe lidar com isso?</w:t>
       </w:r>
     </w:p>
     <w:p>
@@ -348,7 +344,7 @@
     </w:p>
     <w:p>
       <w:r>
-        <w:t>E quem está no meio disso responde tudo, não agrada ninguém e ainda vira o vilão da história — ou simplesmente ignora, e o silêncio vira prova de descaso.</w:t>
+        <w:t>E quem está no meio disso responde tudo, não agrada ninguém e ainda vira o vilão da história ou simplesmente ignora, e o silêncio vira prova de descaso.</w:t>
       </w:r>
     </w:p>
     <w:p>
@@ -358,12 +354,12 @@
     </w:p>
     <w:p>
       <w:r>
-        <w:t>A Strategia organiza a comunicação do condomínio com canal certo, resposta no prazo e protocolo — sem depender da paciência de ninguém.</w:t>
+        <w:t>A Strategia organiza a comunicação do condomínio com canal certo, resposta no prazo e protocolo sem depender da paciência de ninguém.</w:t>
       </w:r>
     </w:p>
     <w:p>
       <w:r>
-        <w:t>Comente: GRUPO aqui e a gente te mostra como funciona, direto no seu direct.</w:t>
+        <w:t>Comente: GRUPO e olhe o seu direct, nossa equipe vai te orientar.</w:t>
       </w:r>
     </w:p>
     <w:p>
@@ -386,12 +382,12 @@
     </w:p>
     <w:p>
       <w:r>
-        <w:t>S3: A saída não é paciência infinita. É método — e isso a gente sabe fazer.</w:t>
+        <w:t>S3: A saída não é paciência infinita. É método, e nisso somos especialistas!</w:t>
       </w:r>
     </w:p>
     <w:p>
       <w:r>
-        <w:t>S4: Comenta GRUPO no post de hoje e recebe no direct como organizamos isso. 👆</w:t>
+        <w:t>S4: No post de hoje aprofundamos nesse assunto, vai lá no feed ver!</w:t>
       </w:r>
     </w:p>
     <w:p>
@@ -435,7 +431,7 @@
     </w:p>
     <w:p>
       <w:r>
-        <w:t>Headline: A última assembleia do seu condomínio teve quórum de verdade — ou foi sempre o mesmo grupinho decidindo por todo mundo?</w:t>
+        <w:t>Headline: A última assembleia do seu condomínio teve quórum de verdade, ou foi sempre o mesmo grupinho decidindo por todo mundo?</w:t>
       </w:r>
     </w:p>
     <w:p>
@@ -458,7 +454,7 @@
     </w:p>
     <w:p>
       <w:r>
-        <w:t>Assembleias com baixa adesão decidem assuntos importantes — reforma, contrato, taxa extra — com poucos presentes.</w:t>
+        <w:t>Assembleias com baixa adesão decidem assuntos importantes, reforma, contrato, taxa extra, com poucos presentes.</w:t>
       </w:r>
     </w:p>
     <w:p>
@@ -560,7 +556,7 @@
     </w:p>
     <w:p>
       <w:r>
-        <w:t>Assembleia esvaziada não significa decisão mais fácil. Significa decisão mais fraca.</w:t>
+        <w:t>Assembleia com poucos moradores não significa decisão mais fácil. Significa decisão mais fraca.</w:t>
       </w:r>
     </w:p>
     <w:p>
@@ -578,7 +574,7 @@
     </w:p>
     <w:p>
       <w:r>
-        <w:t>Quer aumentar a participação nas assembleias do seu condomínio?</w:t>
+        <w:t>Quer entender como a Strategia pode organizar e conduzir as assembleias no seu condomínio?</w:t>
       </w:r>
     </w:p>
     <w:p>
@@ -596,7 +592,7 @@
     </w:p>
     <w:p>
       <w:r>
-        <w:t>Assembleia esvaziada decide assuntos grandes com poucas pessoas — e isso é risco, não economia de tempo.</w:t>
+        <w:t>Assembleia vazia decide assuntos grandes com poucas pessoas, e isso é risco, não economia de tempo.</w:t>
       </w:r>
     </w:p>
     <w:p>
@@ -606,7 +602,7 @@
     </w:p>
     <w:p>
       <w:r>
-        <w:t>Comente: ASSEMBLEIA e olhe o seu direct — nossa equipe vai te orientar.</w:t>
+        <w:t>Comente: ASSEMBLEIA e olhe o seu direct, nossa equipe vai te orientar.</w:t>
       </w:r>
     </w:p>
     <w:p>
@@ -624,7 +620,7 @@
     </w:p>
     <w:p>
       <w:r>
-        <w:t>S2: Decisão tomada com pouca gente pode ser questionada depois — e isso custa caro.</w:t>
+        <w:t>S2: Decisão tomada com pouca gente pode ser questionada depois, e isso custa caro.</w:t>
       </w:r>
     </w:p>
     <w:p>
@@ -670,7 +666,7 @@
     </w:p>
     <w:p>
       <w:r>
-        <w:t>Headline: Ele nunca vai à assembleia. Mas é o primeiro a comentar tudo errado no grupo.</w:t>
+        <w:t>Headline: Ele nunca vai à assembleia. Mas no grupo, é o primeiro morador a reclamar de cada decisão.</w:t>
       </w:r>
     </w:p>
     <w:p>
@@ -688,22 +684,22 @@
     </w:p>
     <w:p>
       <w:r>
-        <w:t>Tem um morador assim em praticamente todo condomínio. Não vai à assembleia, não lê o edital, não participa da decisão — mas é o primeiro a reclamar quando o resultado não agrada.</w:t>
+        <w:t>Tem um morador assim em praticamente todo condomínio. Não vai à assembleia, não lê o edital, não participa da decisão, mas é o primeiro a reclamar quando o resultado não agrada.</w:t>
       </w:r>
     </w:p>
     <w:p>
       <w:r>
-        <w:t>E a gestão atual, sem método, acaba decidindo no improviso pra agradar quem grita mais alto — não quem está com a razão.</w:t>
+        <w:t>E se a gestão atual não tiver método, acaba decidindo no improviso para agradar quem grita mais alto, não quem está com a razão.</w:t>
       </w:r>
     </w:p>
     <w:p>
       <w:r>
-        <w:t>Gestão profissional não decide pela pressão do momento. Decide com critério, documentação e transparência — pra qualquer morador entender o porquê, mesmo sem ter ido à reunião.</w:t>
+        <w:t>Gestão profissional não decide pela pressão do momento. Decide com critério, documentação e transparência para qualquer morador entender o porquê, mesmo sem ter ido à reunião.</w:t>
       </w:r>
     </w:p>
     <w:p>
       <w:r>
-        <w:t>Comente: GESTÃO aqui e a gente te explica como isso funciona na prática, direto no seu direct.</w:t>
+        <w:t>Comente: SÍNDICO, nós vamos te explicar como isso funciona na prática, direto no seu direct.</w:t>
       </w:r>
     </w:p>
     <w:p>
@@ -716,7 +712,7 @@
     </w:p>
     <w:p>
       <w:r>
-        <w:t>S1: Tem um morador assim no seu condomínio? (enquete: Tem, e é demais / Tem, mas é tranquilo / Aqui não tem)</w:t>
+        <w:t>S1: Ele nunca vai à assembleia. Mas no grupo, é o primeiro morador a reclamar de cada decisão. Tem morador assim no seu condomínio? (enquete: Tem, e é demais / Tem, mas é tranquilo / Aqui não tem)</w:t>
       </w:r>
     </w:p>
     <w:p>
@@ -731,7 +727,7 @@
     </w:p>
     <w:p>
       <w:r>
-        <w:t>S4: Comenta GESTÃO no post de hoje e a gente te mostra como funciona. 👆</w:t>
+        <w:t>S4: No post de hoje aprofundamos nesse assunto, vai lá no feed ver! 😉</w:t>
       </w:r>
     </w:p>
     <w:p>
@@ -775,7 +771,7 @@
     </w:p>
     <w:p>
       <w:r>
-        <w:t>Headline: "Meu cachorro não late." Late sim — e o prédio inteiro confirma.</w:t>
+        <w:t>Headline: "Meu cachorro não late." Late sim, e o prédio inteiro confirma...</w:t>
       </w:r>
     </w:p>
     <w:p>
@@ -831,7 +827,7 @@
     </w:p>
     <w:p>
       <w:r>
-        <w:t>→ Síndico vira mediador de briga sem instrumento legal pra agir.</w:t>
+        <w:t>Síndico vira mediador de briga sem instrumento legal para agir.</w:t>
       </w:r>
     </w:p>
     <w:p>
@@ -859,7 +855,7 @@
     </w:p>
     <w:p>
       <w:r>
-        <w:t>Canal formal para registrar reclamação — sem depender do grupo.</w:t>
+        <w:t>Canal formal para registrar reclamação, sem depender do grupo.</w:t>
       </w:r>
     </w:p>
     <w:p>
@@ -923,7 +919,7 @@
     </w:p>
     <w:p>
       <w:r>
-        <w:t>Comente: REGIMENTO e olhe o seu direct.</w:t>
+        <w:t>Comente: CONDOMÍNIO, e olhe o seu direct.</w:t>
       </w:r>
     </w:p>
     <w:p>
@@ -941,12 +937,12 @@
     </w:p>
     <w:p>
       <w:r>
-        <w:t>A Strategia revisa o regimento interno e cria um canal formal de reclamação — pra resolver sem depender do grupo de WhatsApp.</w:t>
+        <w:t>A Strategia revisa o regimento interno e cria um canal formal de reclamação, para resolver sem depender do grupo de WhatsApp.</w:t>
       </w:r>
     </w:p>
     <w:p>
       <w:r>
-        <w:t>Comente: REGIMENTO e olhe o seu direct — nossa equipe vai te orientar.</w:t>
+        <w:t>Comente: CONDOMÍNIO e olhe o seu direct, nossa equipe vai te orientar.</w:t>
       </w:r>
     </w:p>
     <w:p>
@@ -969,7 +965,7 @@
     </w:p>
     <w:p>
       <w:r>
-        <w:t>S3: Regimento atualizado dá instrumento pro síndico agir — sem brigar com ninguém.</w:t>
+        <w:t>S3: Regimento atualizado dá instrumento pro síndico agir, sem brigar com ninguém.</w:t>
       </w:r>
     </w:p>
     <w:p>
@@ -1028,27 +1024,22 @@
     </w:p>
     <w:p>
       <w:r>
-        <w:t>Você achou que o Volume 1 era exagero. Aí chegou o Volume 2.</w:t>
+        <w:t>Há vários tipos de moradores: aquele que quer proibir o vizinho de cozinhar peixe, que reclama do elevador rápido demais, que quer proibir criança de correr no corredor porque o barulho estressava o gato.</w:t>
       </w:r>
     </w:p>
     <w:p>
       <w:r>
-        <w:t>Tem morador que quis proibir o vizinho de cozinhar peixe. Tem morador que reclamou do elevador rápido demais. Tem morador que quis proibir criança de correr no corredor porque o barulho estressava o gato.</w:t>
+        <w:t>Quem gerencia condomínio todo dia sabe: a lista não tem fim. E é por isso que gestão profissional existe, para filtrar o que é regra real do que é capricho do dia, sem desgastar o síndico e moradores com isso.</w:t>
       </w:r>
     </w:p>
     <w:p>
       <w:r>
-        <w:t>A gente não inventou nada disso. Quem gerencia condomínio todo dia sabe: a lista não tem fim.</w:t>
+        <w:t>Quer entender como a Strategia pode resolver conflitos entre moradores no seu condomínio?</w:t>
       </w:r>
     </w:p>
     <w:p>
       <w:r>
-        <w:t>E é por isso que gestão profissional existe — pra filtrar o que é regra real do que é capricho do dia, sem desgastar o síndico morador com isso.</w:t>
-      </w:r>
-    </w:p>
-    <w:p>
-      <w:r>
-        <w:t>Comente: ABSURDO aqui e a gente te manda os outros casos mais inacreditáveis que já vimos.</w:t>
+        <w:t>Comente: CONDOMÍNIO, e olhe o seu direct.</w:t>
       </w:r>
     </w:p>
     <w:p>
@@ -1071,12 +1062,12 @@
     </w:p>
     <w:p>
       <w:r>
-        <w:t>S3: Tem gestão pra tudo. Até pra essas situações que parecem ficção.</w:t>
+        <w:t>S3: Tem gestão para tudo. Até para essas situações que parecem ficção.</w:t>
       </w:r>
     </w:p>
     <w:p>
       <w:r>
-        <w:t>S4: Comenta ABSURDO no post de hoje e recebe mais casos no direct. 👆</w:t>
+        <w:t>S4: Desenvolvemos esse tema no post de hoje, vai lá ver! 😉</w:t>
       </w:r>
     </w:p>
     <w:p>
@@ -1286,12 +1277,12 @@
     </w:p>
     <w:p>
       <w:r>
-        <w:t>A Strategia implementa o fluxo formal de aprovação de obras, com documentação técnica e vistoria — protegendo o condomínio antes que o problema apareça.</w:t>
+        <w:t>A Strategia implementa o fluxo formal de aprovação de obras, com documentação técnica e vistoria, protegendo o condomínio antes que o problema apareça.</w:t>
       </w:r>
     </w:p>
     <w:p>
       <w:r>
-        <w:t>Comente: REFORMA e olhe o seu direct — nossa equipe vai te orientar.</w:t>
+        <w:t>Comente: REFORMA e olhe o seu direct, nossa equipe vai te orientar.</w:t>
       </w:r>
     </w:p>
     <w:p>
@@ -1314,7 +1305,7 @@
     </w:p>
     <w:p>
       <w:r>
-        <w:t>S3: Termo de responsabilidade e vistoria protegem o condomínio inteiro — não só o morador.</w:t>
+        <w:t>S3: Termo de responsabilidade e vistoria protegem o condomínio inteiro, não só o morador.</w:t>
       </w:r>
     </w:p>
     <w:p>
@@ -1373,22 +1364,22 @@
     </w:p>
     <w:p>
       <w:r>
-        <w:t>Contrato de prestador. Ata de assembleia. Termo de acordo com morador inadimplente. Tudo isso passa pela assinatura do síndico — e a maioria assina confiando que está tudo certo.</w:t>
+        <w:t>Contrato de prestador. Ata de assembleia. Termo de acordo com morador inadimplente. Tudo isso passa pela assinatura do síndico, e a maioria assina confiando que está tudo certo.</w:t>
       </w:r>
     </w:p>
     <w:p>
       <w:r>
-        <w:t>Até o dia em que não está. E o síndico morador descobre, sozinho, que respondeu por uma cláusula que nem tinha lido com atenção.</w:t>
+        <w:t>Até o dia em que não está. E o síndico descobre, sozinho, que respondeu por uma cláusula que nem tinha lido com atenção.</w:t>
       </w:r>
     </w:p>
     <w:p>
       <w:r>
-        <w:t>Gestão profissional existe justamente pra isso: ler antes, entender antes, decidir com clareza — sem o síndico carregar esse peso sozinho.</w:t>
+        <w:t>Gestão profissional existe justamente pra isso: ler e entender antes, decidir com clareza depois.</w:t>
       </w:r>
     </w:p>
     <w:p>
       <w:r>
-        <w:t>Comente: SEGURO aqui e a gente te explica como funciona a gestão profissional da Strategia, direto no seu direct.</w:t>
+        <w:t>Comente: SÍNDICO, e vamos te explicar como funciona a gestão profissional da Strategia, direto no seu direct.</w:t>
       </w:r>
     </w:p>
     <w:p>
@@ -1396,12 +1387,12 @@
         <w:rPr>
           <w:b/>
         </w:rPr>
-        <w:t>Stories (sequência de 4)</w:t>
+        <w:t>Stories (sequência de 3)</w:t>
       </w:r>
     </w:p>
     <w:p>
       <w:r>
-        <w:t>S1: Você já assinou algo no condomínio sem ter 100% de certeza do que estava ali? (enquete: Já, mais de uma vez / Nunca, leio tudo / Não sou síndico)</w:t>
+        <w:t>S1: Será que o síndico do seu condomínio já assinou algum documento sem ter 100% de certeza do que estava assinando? (enquete: Já, mais de uma vez / Nunca, leio tudo / Não sou síndico)</w:t>
       </w:r>
     </w:p>
     <w:p>
@@ -1411,12 +1402,7 @@
     </w:p>
     <w:p>
       <w:r>
-        <w:t>S3: Gestão profissional lê, entende e decide com você — não no lugar de você.</w:t>
-      </w:r>
-    </w:p>
-    <w:p>
-      <w:r>
-        <w:t>S4: Comenta SEGURO no post de hoje e fala com a gente. 👆</w:t>
+        <w:t>S3: Gestão profissional lê, entende e decide com você, não no lugar de você.</w:t>
       </w:r>
     </w:p>
     <w:sectPr>

</xml_diff>

<commit_message>
Corrige CTA card 7 e remove nota interna do calendario agosto 2026
Co-Authored-By: Claude Sonnet 4.6 <noreply@anthropic.com>
</commit_message>
<xml_diff>
--- a/strategia-sindicos/calendarios-editoriais/Calendario_Editorial_Strategia_Agosto2026.docx
+++ b/strategia-sindicos/calendarios-editoriais/Calendario_Editorial_Strategia_Agosto2026.docx
@@ -25,14 +25,6 @@
           <w:b/>
         </w:rPr>
         <w:t>● AGOSTO — Datas: 05/08 (Qua) · 07/08 (Sex) · 12/08 (Qua) · 14/08 (Sex) · 19/08 (Qua) · 21/08 (Sex) · 26/08 (Qua) · 28/08 (Sex)</w:t>
-      </w:r>
-    </w:p>
-    <w:p>
-      <w:pPr>
-        <w:ind w:left="400"/>
-      </w:pPr>
-      <w:r>
-        <w:t>Nota: A partir de agosto, parte dos posts de Estático passa a usar formato storytelling (dor → conflito → virada → CTA), inspirado em conteúdos de referência sobre o dia a dia do síndico. Aqui a narrativa fala com o condomínio — residencial ou comercial — que está sem síndico profissional, com síndico morador sobrecarregado, ou insatisfeito com a gestão atual. CTA via comentário + ManyChat, liberando o material/orçamento no direct.</w:t>
       </w:r>
     </w:p>
     <w:p>
@@ -234,7 +226,7 @@
     </w:p>
     <w:p>
       <w:r>
-        <w:t>Comente: TERCEIRIZADOS e olhe o seu direct.</w:t>
+        <w:t>Comente: CONDOMÍNIO e olhe o seu direct.</w:t>
       </w:r>
     </w:p>
     <w:p>

</xml_diff>